<commit_message>
docs: contrato Word con logo UPA real (esquina superior derecha)
- Convierte el logo guardado como 'logo_upla.png.jpg' a PNG limpio
  (docs/assets/logo_upa.png, 58 KB, 406x124 px).
- Regenera docs/CONTRATO_CONFIDENCIALIDAD_DATOS.docx (100 KB,
  antes 41 KB) con la imagen real del logo en el header de cada
  pagina, esquina superior derecha, detras del texto del cuerpo.
- 6 paginas Word: 12 secciones del contrato + 4 bloques de firma
  + Anexo A con resumen para los apoderados.
- El script docs/build_contrato_docx.py detecta la presencia del
  logo y lo incrusta automaticamente; si no esta, usa placeholder
  textual. Listo para regenerar en cualquier actualizacion.
</commit_message>
<xml_diff>
--- a/docs/CONTRATO_CONFIDENCIALIDAD_DATOS.docx
+++ b/docs/CONTRATO_CONFIDENCIALIDAD_DATOS.docx
@@ -2006,14 +2006,38 @@
             <w:jc w:val="right"/>
           </w:pPr>
           <w:r>
-            <w:rPr>
-              <w:i/>
-              <w:color w:val="555555"/>
-              <w:sz w:val="18"/>
-            </w:rPr>
-            <w:t>LOGO UPA</w:t>
-            <w:br/>
-            <w:t>(guardar imagen en docs/assets/logo_upa.png)</w:t>
+            <w:drawing>
+              <wp:inline xmlns:a="http://schemas.openxmlformats.org/drawingml/2006/main" xmlns:pic="http://schemas.openxmlformats.org/drawingml/2006/picture">
+                <wp:extent cx="1980000" cy="604729"/>
+                <wp:docPr id="1" name="Picture 1"/>
+                <wp:cNvGraphicFramePr>
+                  <a:graphicFrameLocks noChangeAspect="1"/>
+                </wp:cNvGraphicFramePr>
+                <a:graphic>
+                  <a:graphicData uri="http://schemas.openxmlformats.org/drawingml/2006/picture">
+                    <pic:pic>
+                      <pic:nvPicPr>
+                        <pic:cNvPr id="0" name="logo_upla.png"/>
+                        <pic:cNvPicPr/>
+                      </pic:nvPicPr>
+                      <pic:blipFill>
+                        <a:blip r:embed="rId1"/>
+                        <a:stretch>
+                          <a:fillRect/>
+                        </a:stretch>
+                      </pic:blipFill>
+                      <pic:spPr>
+                        <a:xfrm>
+                          <a:off x="0" y="0"/>
+                          <a:ext cx="1980000" cy="604729"/>
+                        </a:xfrm>
+                        <a:prstGeom prst="rect"/>
+                      </pic:spPr>
+                    </pic:pic>
+                  </a:graphicData>
+                </a:graphic>
+              </wp:inline>
+            </w:drawing>
           </w:r>
         </w:p>
       </w:tc>

</xml_diff>